<commit_message>
docs: replace module-one reports with fixed versions
</commit_message>
<xml_diff>
--- a/module1-basic-testing/docs/test-report.docx
+++ b/module1-basic-testing/docs/test-report.docx
@@ -11,8 +11,6 @@
           <w:szCs w:val="72"/>
         </w:rPr>
       </w:pPr>
-      <w:bookmarkStart w:id="19" w:name="_GoBack"/>
-      <w:bookmarkEnd w:id="19"/>
     </w:p>
     <w:p>
       <w:pPr>
@@ -58,7 +56,57 @@
           <w:sz w:val="72"/>
           <w:szCs w:val="72"/>
         </w:rPr>
-        <w:t>国际联运单跨链协同平台</w:t>
+        <w:t>国际联运</w:t>
+      </w:r>
+      <w:r>
+        <w:rPr>
+          <w:rFonts w:hint="eastAsia" w:eastAsia="黑体"/>
+          <w:b/>
+          <w:bCs/>
+          <w:i/>
+          <w:color w:val="0000FF"/>
+          <w:sz w:val="72"/>
+          <w:szCs w:val="72"/>
+          <w:lang w:val="en-US" w:eastAsia="zh-CN"/>
+        </w:rPr>
+        <w:t>单</w:t>
+      </w:r>
+      <w:r>
+        <w:rPr>
+          <w:rFonts w:eastAsia="黑体"/>
+          <w:b/>
+          <w:bCs/>
+          <w:i/>
+          <w:color w:val="0000FF"/>
+          <w:sz w:val="72"/>
+          <w:szCs w:val="72"/>
+        </w:rPr>
+        <w:t>跨链</w:t>
+      </w:r>
+      <w:r>
+        <w:rPr>
+          <w:rFonts w:hint="eastAsia" w:eastAsia="黑体"/>
+          <w:b/>
+          <w:bCs/>
+          <w:i/>
+          <w:color w:val="0000FF"/>
+          <w:sz w:val="72"/>
+          <w:szCs w:val="72"/>
+          <w:lang w:val="en-US" w:eastAsia="zh-CN"/>
+        </w:rPr>
+        <w:t>协同</w:t>
+      </w:r>
+      <w:r>
+        <w:rPr>
+          <w:rFonts w:eastAsia="黑体"/>
+          <w:b/>
+          <w:bCs/>
+          <w:i/>
+          <w:color w:val="0000FF"/>
+          <w:sz w:val="72"/>
+          <w:szCs w:val="72"/>
+        </w:rPr>
+        <w:t>平台</w:t>
       </w:r>
     </w:p>
     <w:p>
@@ -223,6 +271,12 @@
             <w:insideH w:val="single" w:color="999999" w:sz="6" w:space="0"/>
             <w:insideV w:val="single" w:color="999999" w:sz="6" w:space="0"/>
           </w:tblBorders>
+          <w:tblCellMar>
+            <w:top w:w="0" w:type="dxa"/>
+            <w:left w:w="108" w:type="dxa"/>
+            <w:bottom w:w="0" w:type="dxa"/>
+            <w:right w:w="108" w:type="dxa"/>
+          </w:tblCellMar>
         </w:tblPrEx>
         <w:trPr>
           <w:jc w:val="center"/>
@@ -432,16 +486,19 @@
               <w:spacing w:line="312" w:lineRule="auto"/>
               <w:jc w:val="center"/>
               <w:rPr>
+                <w:rFonts w:hint="eastAsia" w:eastAsia="宋体"/>
                 <w:szCs w:val="21"/>
+                <w:lang w:eastAsia="zh-CN"/>
               </w:rPr>
             </w:pPr>
             <w:r>
               <w:rPr>
-                <w:rFonts w:ascii="宋体" w:hAnsi="宋体" w:eastAsia="宋体"/>
+                <w:rFonts w:hint="eastAsia" w:ascii="宋体" w:hAnsi="宋体"/>
                 <w:color w:val="0000FF"/>
                 <w:sz w:val="22"/>
-              </w:rPr>
-              <w:t>Zhu Jiacheng</w:t>
+                <w:lang w:eastAsia="zh-CN"/>
+              </w:rPr>
+              <w:t>朱佳诚</w:t>
             </w:r>
           </w:p>
         </w:tc>
@@ -486,7 +543,7 @@
                 <w:color w:val="0000FF"/>
                 <w:sz w:val="22"/>
               </w:rPr>
-              <w:t>2026.09.13</w:t>
+              <w:t>2026-09-15</w:t>
             </w:r>
           </w:p>
         </w:tc>
@@ -509,7 +566,7 @@
                 <w:color w:val="0000FF"/>
                 <w:sz w:val="22"/>
               </w:rPr>
-              <w:t>1.01</w:t>
+              <w:t>V1.2</w:t>
             </w:r>
           </w:p>
         </w:tc>
@@ -532,7 +589,7 @@
                 <w:color w:val="0000FF"/>
                 <w:sz w:val="22"/>
               </w:rPr>
-              <w:t>补充缺陷探测与成员贡献</w:t>
+              <w:t>完成三个缺陷修复与回归验证</w:t>
             </w:r>
           </w:p>
         </w:tc>
@@ -546,16 +603,19 @@
               <w:spacing w:line="312" w:lineRule="auto"/>
               <w:jc w:val="center"/>
               <w:rPr>
+                <w:rFonts w:hint="eastAsia" w:eastAsia="宋体"/>
                 <w:szCs w:val="21"/>
+                <w:lang w:val="en-US" w:eastAsia="zh-CN"/>
               </w:rPr>
             </w:pPr>
             <w:r>
               <w:rPr>
-                <w:rFonts w:ascii="宋体" w:hAnsi="宋体" w:eastAsia="宋体"/>
+                <w:rFonts w:hint="eastAsia" w:ascii="宋体" w:hAnsi="宋体"/>
                 <w:color w:val="0000FF"/>
                 <w:sz w:val="20"/>
-              </w:rPr>
-              <w:t>Zhu / Zhang</w:t>
+                <w:lang w:eastAsia="zh-CN"/>
+              </w:rPr>
+              <w:t>朱佳诚</w:t>
             </w:r>
           </w:p>
         </w:tc>
@@ -1781,6 +1841,8 @@
         <w:t>1 被测对象概述</w:t>
       </w:r>
       <w:bookmarkEnd w:id="0"/>
+      <w:bookmarkStart w:id="19" w:name="_GoBack"/>
+      <w:bookmarkEnd w:id="19"/>
     </w:p>
     <w:p>
       <w:pPr>
@@ -1797,7 +1859,41 @@
           <w:color w:val="0000FF"/>
           <w:sz w:val="24"/>
         </w:rPr>
-        <w:t>被测对象为国际联运单跨链协同平台。原系统采用 Spring Boot、Vue、MySQL 和 Hyperledger Fabric，面向国际联运单的登录鉴权、运单处理、电子凭证、链上存证与跨链协同等业务。系统后端以 Controller、Service、Repository 和 FabricGateway 分层：Controller 提供接口，Service 承担认证、权限和跨链任务规则，Repository 访问持久化数据，FabricGateway 抽象链上读写。</w:t>
+        <w:t>被测对象为国际联运</w:t>
+      </w:r>
+      <w:r>
+        <w:rPr>
+          <w:rFonts w:hint="eastAsia" w:ascii="宋体" w:hAnsi="宋体"/>
+          <w:color w:val="0000FF"/>
+          <w:sz w:val="24"/>
+          <w:lang w:val="en-US" w:eastAsia="zh-CN"/>
+        </w:rPr>
+        <w:t>单</w:t>
+      </w:r>
+      <w:r>
+        <w:rPr>
+          <w:rFonts w:ascii="宋体" w:hAnsi="宋体" w:eastAsia="宋体"/>
+          <w:color w:val="0000FF"/>
+          <w:sz w:val="24"/>
+        </w:rPr>
+        <w:t>跨链</w:t>
+      </w:r>
+      <w:r>
+        <w:rPr>
+          <w:rFonts w:hint="eastAsia" w:ascii="宋体" w:hAnsi="宋体"/>
+          <w:color w:val="0000FF"/>
+          <w:sz w:val="24"/>
+          <w:lang w:val="en-US" w:eastAsia="zh-CN"/>
+        </w:rPr>
+        <w:t>协同</w:t>
+      </w:r>
+      <w:r>
+        <w:rPr>
+          <w:rFonts w:ascii="宋体" w:hAnsi="宋体" w:eastAsia="宋体"/>
+          <w:color w:val="0000FF"/>
+          <w:sz w:val="24"/>
+        </w:rPr>
+        <w:t>平台。原系统采用 Spring Boot、Vue、MySQL 和 Hyperledger Fabric，面向国际联运单的登录鉴权、运单处理、电子凭证、链上存证与跨链协同等业务。系统后端以 Controller、Service、Repository 和 FabricGateway 分层：Controller 提供接口，Service 承担认证、权限和跨链任务规则，Repository 访问持久化数据，FabricGateway 抽象链上读写。</w:t>
       </w:r>
     </w:p>
     <w:p>
@@ -2047,7 +2143,6 @@
             <w:insideH w:val="single" w:color="auto" w:sz="4" w:space="0"/>
             <w:insideV w:val="single" w:color="auto" w:sz="4" w:space="0"/>
           </w:tblBorders>
-          <w:shd w:val="clear" w:color="auto" w:fill="FFFFFF"/>
           <w:tblCellMar>
             <w:top w:w="15" w:type="dxa"/>
             <w:left w:w="15" w:type="dxa"/>
@@ -2227,7 +2322,6 @@
             <w:insideH w:val="single" w:color="auto" w:sz="4" w:space="0"/>
             <w:insideV w:val="single" w:color="auto" w:sz="4" w:space="0"/>
           </w:tblBorders>
-          <w:shd w:val="clear" w:color="auto" w:fill="FFFFFF"/>
           <w:tblCellMar>
             <w:top w:w="15" w:type="dxa"/>
             <w:left w:w="15" w:type="dxa"/>
@@ -2353,25 +2447,7 @@
           <w:color w:val="0000FF"/>
           <w:sz w:val="24"/>
         </w:rPr>
-        <w:t>黑盒设计采用等价类、边界值和场景法。JWT 的有效、篡改、空值和过期输入分别选择代表值；跨链请求的源目标链相同、有效期过去/未来等临界条件采用边界值；登录、Bearer 身份建立、任务创建、跨链执行和 retry 采用连续业务场景。这样既覆盖正常路径，也覆盖服务对非法输入和异常状态的处理。</w:t>
-      </w:r>
-    </w:p>
-    <w:p>
-      <w:pPr>
-        <w:spacing w:line="312" w:lineRule="auto"/>
-        <w:ind w:firstLine="420"/>
-        <w:rPr>
-          <w:iCs/>
-          <w:color w:val="0000FF"/>
-        </w:rPr>
-      </w:pPr>
-      <w:r>
-        <w:rPr>
-          <w:rFonts w:ascii="宋体" w:hAnsi="宋体" w:eastAsia="宋体"/>
-          <w:color w:val="0000FF"/>
-          <w:sz w:val="24"/>
-        </w:rPr>
-        <w:t>灰盒分析结合代码分支和状态转换进行。通过阅读 JwtService 的签名与过期判断、AccessControlService 的角色分支、CrossChainService 的 CREATED/VERIFIED/CONFIRMED/FAILED 状态流转，确定断言位置；Mockito 替代 Repository 和 FabricGateway，使异常分支可控、结果可复现。</w:t>
+        <w:t>黑盒设计采用等价类、边界值、场景法和状态转换法。JWT 的有效、篡改、空值和过期输入分别选择代表值；跨链请求的源目标链相同、有效期过去/未来等临界条件采用边界值；登录、Bearer 身份建立、任务创建和跨链执行采用连续业务场景；跨链任务状态转换和 retry 幂等性按状态规则检查。这样既覆盖正常路径，也覆盖服务对非法输入和异常状态的处理。</w:t>
       </w:r>
     </w:p>
     <w:p>
@@ -2440,8 +2516,8 @@
           <w:szCs w:val="28"/>
         </w:rPr>
       </w:pPr>
-      <w:bookmarkStart w:id="5" w:name="_Toc35958953"/>
-      <w:bookmarkStart w:id="6" w:name="_Toc22618"/>
+      <w:bookmarkStart w:id="5" w:name="_Toc22618"/>
+      <w:bookmarkStart w:id="6" w:name="_Toc35958953"/>
       <w:r>
         <w:rPr>
           <w:sz w:val="28"/>
@@ -2511,7 +2587,6 @@
             <w:insideH w:val="single" w:color="auto" w:sz="4" w:space="0"/>
             <w:insideV w:val="single" w:color="auto" w:sz="4" w:space="0"/>
           </w:tblBorders>
-          <w:shd w:val="clear" w:color="auto" w:fill="FFFFFF"/>
           <w:tblCellMar>
             <w:top w:w="15" w:type="dxa"/>
             <w:left w:w="15" w:type="dxa"/>
@@ -2835,7 +2910,6 @@
             <w:insideH w:val="single" w:color="auto" w:sz="4" w:space="0"/>
             <w:insideV w:val="single" w:color="auto" w:sz="4" w:space="0"/>
           </w:tblBorders>
-          <w:shd w:val="clear" w:color="auto" w:fill="FFFFFF"/>
           <w:tblCellMar>
             <w:top w:w="15" w:type="dxa"/>
             <w:left w:w="15" w:type="dxa"/>
@@ -4210,7 +4284,7 @@
           <w:color w:val="0000FF"/>
           <w:sz w:val="24"/>
         </w:rPr>
-        <w:t>认证与访问控制：23 条，23 条通过，0 条失败，通过率 100%；跨链任务状态控制：9 条，9 条通过，0 条失败，通过率 100%。汇总：常规自动化用例共 32 条，通过 32 条，失败 0 条，通过率 100%，自动化率 100%。执行日志保存于 evidence/baseline-32.log。</w:t>
+        <w:t>认证与访问控制：23 条，23 条通过，0 条失败，通过率 100%；跨链任务状态控制：9 条，9 条通过，0 条失败，通过率 100%。汇总：常规自动化用例共 32 条，通过 32 条，失败 0 条，通过率 100%，自动化覆盖率 100%（32/32）。修复后 3 条缺陷回归用例全部通过。执行日志保存于 evidence/after-fix/baseline-32-after-fix.log。</w:t>
       </w:r>
     </w:p>
     <w:p>
@@ -4228,7 +4302,7 @@
           <w:color w:val="0000FF"/>
           <w:sz w:val="24"/>
         </w:rPr>
-        <w:t>为发现潜在缺陷，另外运行 3 条定向缺陷探测。该探测集故意使用失败断言确认缺陷现象，独立于上述 32 条常规回归用例，不计入常规用例通过率。</w:t>
+        <w:t>针对已确认缺陷，另外运行 3 条定向回归测试。D-001、D-002、D-003 的修复后断言均通过，独立于上述 32 条常规回归用例，不计入常规用例通过率。</w:t>
       </w:r>
     </w:p>
     <w:p>
@@ -4267,7 +4341,22 @@
           <w:color w:val="0000FF"/>
           <w:sz w:val="24"/>
         </w:rPr>
-        <w:t>D-001 跨链目标链失败仍被确认。严重程度：高；自动定向探测发现。目标链回执为 FAILED 时任务仍置为 CONFIRMED，造成状态不一致。发现人：Zhu Jiacheng。状态：已确认、未修复、未关闭。</w:t>
+        <w:t>D-001 跨链目标链失败仍被确认。严重程度：高；自动定向探测发现。目标链回执为 FAILED 时任务曾被置为 CONFIRMED，造成状态不一致。发现人：朱佳诚。状态：已修复、已回归、已关闭。</w:t>
+      </w:r>
+      <w:r>
+        <w:rPr>
+          <w:rFonts w:hint="eastAsia" w:ascii="宋体" w:hAnsi="宋体"/>
+          <w:color w:val="0000FF"/>
+          <w:sz w:val="24"/>
+          <w:lang w:eastAsia="zh-CN"/>
+        </w:rPr>
+      </w:r>
+      <w:r>
+        <w:rPr>
+          <w:rFonts w:ascii="宋体" w:hAnsi="宋体" w:eastAsia="宋体"/>
+          <w:color w:val="0000FF"/>
+          <w:sz w:val="24"/>
+        </w:rPr>
       </w:r>
     </w:p>
     <w:p>
@@ -4285,7 +4374,22 @@
           <w:color w:val="0000FF"/>
           <w:sz w:val="24"/>
         </w:rPr>
-        <w:t>D-002 JWT 过期边界被接受。严重程度：中；自动定向探测发现。Token 过期秒等于当前秒时仍被接受。发现人：Zhu Jiacheng。状态：已确认、未修复、未关闭。</w:t>
+        <w:t>D-002 JWT 过期边界被接受。严重程度：中；自动定向探测发现。Token 过期秒等于当前秒时曾被接受。发现人：朱佳诚。状态：已修复、已回归、已关闭。</w:t>
+      </w:r>
+      <w:r>
+        <w:rPr>
+          <w:rFonts w:hint="eastAsia" w:ascii="宋体" w:hAnsi="宋体"/>
+          <w:color w:val="0000FF"/>
+          <w:sz w:val="24"/>
+          <w:lang w:eastAsia="zh-CN"/>
+        </w:rPr>
+      </w:r>
+      <w:r>
+        <w:rPr>
+          <w:rFonts w:ascii="宋体" w:hAnsi="宋体" w:eastAsia="宋体"/>
+          <w:color w:val="0000FF"/>
+          <w:sz w:val="24"/>
+        </w:rPr>
       </w:r>
     </w:p>
     <w:p>
@@ -4303,7 +4407,22 @@
           <w:color w:val="0000FF"/>
           <w:sz w:val="24"/>
         </w:rPr>
-        <w:t>D-003 文件哈希为空仍通过跨链前置检查。严重程度：高；自动定向探测发现。哈希均为空时前置检查仍通过，削弱完整性前提。发现人：Zhang Yang。状态：已确认、未修复、未关闭。</w:t>
+        <w:t>D-003 文件哈希为空仍通过跨链前置检查。严重程度：高；自动定向探测发现。哈希均为空时前置检查曾通过，削弱完整性前提。发现人：张阳。状态：已修复、已回归、已关闭。</w:t>
+      </w:r>
+      <w:r>
+        <w:rPr>
+          <w:rFonts w:hint="eastAsia" w:ascii="宋体" w:hAnsi="宋体"/>
+          <w:color w:val="0000FF"/>
+          <w:sz w:val="24"/>
+          <w:lang w:eastAsia="zh-CN"/>
+        </w:rPr>
+      </w:r>
+      <w:r>
+        <w:rPr>
+          <w:rFonts w:ascii="宋体" w:hAnsi="宋体" w:eastAsia="宋体"/>
+          <w:color w:val="0000FF"/>
+          <w:sz w:val="24"/>
+        </w:rPr>
       </w:r>
     </w:p>
     <w:p>
@@ -4342,7 +4461,7 @@
           <w:color w:val="0000FF"/>
           <w:sz w:val="24"/>
         </w:rPr>
-        <w:t>D-001：构造含 targetTxId 且 status=FAILED 的目标链回执后，execute() 未校验回执 status，随后无条件将任务置为 CONFIRMED。根因是确认条件只依赖目标交易标识，未纳入目标链业务结果。</w:t>
+        <w:t>D-001：构造含 targetTxId 且 status=FAILED 的目标链回执后，旧逻辑未校验回执 status，随后无条件将任务置为 CONFIRMED。根因是确认条件只依赖目标交易标识，未纳入目标链业务结果。修复时增加回执状态校验，仅 SUCCESS 允许进入 VERIFIED/CONFIRMED；FAILED 或未知状态改为 FAILED 并保存失败原因。修复后定向回归结果为 taskStatus=FAILED、receiptStatus=FAILED。</w:t>
       </w:r>
     </w:p>
     <w:p>
@@ -4360,7 +4479,7 @@
           <w:color w:val="0000FF"/>
           <w:sz w:val="24"/>
         </w:rPr>
-        <w:t>D-002：parse() 以“过期秒 &lt; 当前秒”判断失效；相等时 Token 仍有效。根因是过期边界比较未覆盖相等时刻。</w:t>
+        <w:t>D-002：parse() 旧逻辑以“过期秒 &lt; 当前秒”判断失效；相等时 Token 仍有效。根因是过期边界比较未覆盖相等时刻。修复为“过期秒 &lt;= 当前秒”即拒绝。修复后定向回归结果为 actualTokenAccepted=false。</w:t>
       </w:r>
     </w:p>
     <w:p>
@@ -4378,7 +4497,7 @@
           <w:color w:val="0000FF"/>
           <w:sz w:val="24"/>
         </w:rPr>
-        <w:t>D-003：precheck() 仅判断文件对象非空，不校验 fileHash 和 encryptedFileHash 是否为非空文本。根因是前置条件检查粒度不足。三项缺陷均已登记并保存原始探测日志；本轮不修改原毕设系统，因此不声明修复、回归或关闭。</w:t>
+        <w:t>D-003：precheck() 旧逻辑仅判断文件对象非空，不校验 fileHash 和 encryptedFileHash 是否为非空文本。根因是前置条件检查粒度不足。修复为同时校验两个哈希字段均为非空文本。修复后定向回归结果为 actualHashCheckPassed=false、overallPassed=false。</w:t>
       </w:r>
     </w:p>
     <w:p>
@@ -4425,7 +4544,7 @@
           <w:color w:val="0000FF"/>
           <w:sz w:val="24"/>
         </w:rPr>
-        <w:t>常规 32 条自动化用例全部通过，已覆盖的认证、授权和跨链正常/已知异常路径表现符合预期；但定向探测确认 3 个未修复缺陷，D-001 与 D-003 对状态一致性和完整性影响较大。因此当前结果可作为模块一测试基线，不宜判定达到发布标准。</w:t>
+        <w:t>常规 32 条自动化用例全部通过，3 条缺陷回归测试也全部通过。D-001、D-002、D-003 已完成修复、回归和关闭，选定范围内的认证、授权和跨链任务状态控制符合预期。由于文件上传与加密、真实 MySQL/Fabric 集成、性能和渗透测试不在本轮范围内，本结论不外推到整个系统。</w:t>
       </w:r>
     </w:p>
     <w:p>
@@ -4458,11 +4577,19 @@
       </w:pPr>
       <w:r>
         <w:rPr>
+          <w:rFonts w:hint="eastAsia" w:ascii="宋体" w:hAnsi="宋体"/>
+          <w:color w:val="0000FF"/>
+          <w:sz w:val="24"/>
+          <w:lang w:eastAsia="zh-CN"/>
+        </w:rPr>
+        <w:t>朱佳诚：工作量 70%。负责测试设计、自动化与执行，完成 SUT 快照、缺陷修复回归及文档整理。</w:t>
+      </w:r>
+      <w:r>
+        <w:rPr>
           <w:rFonts w:ascii="宋体" w:hAnsi="宋体" w:eastAsia="宋体"/>
           <w:color w:val="0000FF"/>
           <w:sz w:val="24"/>
         </w:rPr>
-        <w:t>Zhu Jiacheng：工作量 70%。负责测试范围与策略、SUT 快照、32 条用例设计与自动化、常规测试执行、D-001/D-002 探测，以及测试用例清单、缺陷报告和测试报告整理。</w:t>
       </w:r>
     </w:p>
     <w:p>
@@ -4476,11 +4603,20 @@
       </w:pPr>
       <w:r>
         <w:rPr>
+          <w:rFonts w:hint="eastAsia" w:ascii="宋体" w:hAnsi="宋体"/>
+          <w:color w:val="0000FF"/>
+          <w:sz w:val="24"/>
+          <w:lang w:eastAsia="zh-CN"/>
+        </w:rPr>
+        <w:t>张阳</w:t>
+      </w:r>
+      <w:r>
+        <w:rPr>
           <w:rFonts w:ascii="宋体" w:hAnsi="宋体" w:eastAsia="宋体"/>
           <w:color w:val="0000FF"/>
           <w:sz w:val="24"/>
         </w:rPr>
-        <w:t>Zhang Yang：工作量 30%。完成 PPT、参与部分代码优化、发现 D-003。</w:t>
+        <w:t>：工作量 30%。完成 PPT、参与部分代码优化、发现 D-003。</w:t>
       </w:r>
     </w:p>
     <w:sectPr>
@@ -4730,13 +4866,8 @@
   <w:p>
     <w:pPr>
       <w:pStyle w:val="7"/>
+      <w:jc w:val="both"/>
     </w:pPr>
-    <w:r>
-      <w:rPr>
-        <w:rFonts w:hint="eastAsia"/>
-      </w:rPr>
-      <w:t>Zhu Jiacheng</w:t>
-    </w:r>
     <w:r>
       <w:tab/>
     </w:r>
@@ -4814,7 +4945,7 @@
     <w:lsdException w:uiPriority="99" w:name="footnote text"/>
     <w:lsdException w:uiPriority="99" w:name="annotation text"/>
     <w:lsdException w:qFormat="1" w:unhideWhenUsed="0" w:uiPriority="0" w:semiHidden="0" w:name="header"/>
-    <w:lsdException w:unhideWhenUsed="0" w:uiPriority="99" w:semiHidden="0" w:name="footer"/>
+    <w:lsdException w:qFormat="1" w:unhideWhenUsed="0" w:uiPriority="99" w:semiHidden="0" w:name="footer"/>
     <w:lsdException w:uiPriority="99" w:name="index heading"/>
     <w:lsdException w:qFormat="1" w:uiPriority="35" w:name="caption"/>
     <w:lsdException w:uiPriority="99" w:name="table of figures"/>
@@ -4823,7 +4954,7 @@
     <w:lsdException w:uiPriority="99" w:name="footnote reference"/>
     <w:lsdException w:uiPriority="99" w:name="annotation reference"/>
     <w:lsdException w:uiPriority="99" w:name="line number"/>
-    <w:lsdException w:unhideWhenUsed="0" w:uiPriority="0" w:name="page number"/>
+    <w:lsdException w:qFormat="1" w:unhideWhenUsed="0" w:uiPriority="0" w:name="page number"/>
     <w:lsdException w:uiPriority="99" w:name="endnote reference"/>
     <w:lsdException w:uiPriority="99" w:name="endnote text"/>
     <w:lsdException w:uiPriority="99" w:name="table of authorities"/>
@@ -4847,7 +4978,7 @@
     <w:lsdException w:qFormat="1" w:unhideWhenUsed="0" w:uiPriority="10" w:semiHidden="0" w:name="Title"/>
     <w:lsdException w:uiPriority="99" w:name="Closing"/>
     <w:lsdException w:uiPriority="99" w:name="Signature"/>
-    <w:lsdException w:uiPriority="1" w:name="Default Paragraph Font"/>
+    <w:lsdException w:qFormat="1" w:uiPriority="1" w:name="Default Paragraph Font"/>
     <w:lsdException w:uiPriority="99" w:name="Body Text"/>
     <w:lsdException w:uiPriority="99" w:name="Body Text Indent"/>
     <w:lsdException w:uiPriority="99" w:name="List Continue"/>
@@ -4885,7 +5016,7 @@
     <w:lsdException w:uiPriority="99" w:name="HTML Sample"/>
     <w:lsdException w:uiPriority="99" w:name="HTML Typewriter"/>
     <w:lsdException w:uiPriority="99" w:name="HTML Variable"/>
-    <w:lsdException w:uiPriority="99" w:name="Normal Table"/>
+    <w:lsdException w:qFormat="1" w:uiPriority="99" w:name="Normal Table"/>
     <w:lsdException w:uiPriority="99" w:name="annotation subject"/>
     <w:lsdException w:uiPriority="99" w:name="Table Simple 1"/>
     <w:lsdException w:uiPriority="99" w:name="Table Simple 2"/>
@@ -5111,12 +5242,14 @@
     <w:name w:val="Default Paragraph Font"/>
     <w:semiHidden/>
     <w:unhideWhenUsed/>
+    <w:qFormat/>
     <w:uiPriority w:val="1"/>
   </w:style>
   <w:style w:type="table" w:default="1" w:styleId="10">
     <w:name w:val="Normal Table"/>
     <w:semiHidden/>
     <w:unhideWhenUsed/>
+    <w:qFormat/>
     <w:uiPriority w:val="99"/>
     <w:tblPr>
       <w:tblCellMar>
@@ -5142,6 +5275,7 @@
     <w:name w:val="footer"/>
     <w:basedOn w:val="1"/>
     <w:link w:val="19"/>
+    <w:qFormat/>
     <w:uiPriority w:val="99"/>
     <w:pPr>
       <w:tabs>
@@ -5239,6 +5373,7 @@
     <w:name w:val="page number"/>
     <w:basedOn w:val="12"/>
     <w:semiHidden/>
+    <w:qFormat/>
     <w:uiPriority w:val="0"/>
   </w:style>
   <w:style w:type="character" w:styleId="15">

</xml_diff>